<commit_message>
Add documentation for repair strategies in simulated clothing store
This commit introduces a new markdown document detailing the functionality of three repair strategies: Random Forest, Random Forest with memory, and Qwen with memory. It outlines the decision-making process after fault detection, commonalities among the strategies, and their respective workflows. Additionally, it includes examples of execution results and references to relevant project files for further exploration.
</commit_message>
<xml_diff>
--- a/docs/arquitetura_e_funcionamento.docx
+++ b/docs/arquitetura_e_funcionamento.docx
@@ -193,14 +193,8 @@
             <w:vAlign w:val="center"/>
           </w:tcPr>
           <w:p>
-            <w:pPr>
-              <w:spacing w:after="40" w:before="40"/>
-            </w:pPr>
             <w:r>
-              <w:rPr>
-                <w:sz w:val="18"/>
-              </w:rPr>
-              <w:t>Falha intermitente e dependência das retentativas</w:t>
+              <w:t>Estoque, falha intermitente, dependência indisponível e reserva bloqueada</w:t>
             </w:r>
           </w:p>
         </w:tc>
@@ -246,14 +240,8 @@
             <w:vAlign w:val="center"/>
           </w:tcPr>
           <w:p>
-            <w:pPr>
-              <w:spacing w:after="40" w:before="40"/>
-            </w:pPr>
             <w:r>
-              <w:rPr>
-                <w:sz w:val="18"/>
-              </w:rPr>
-              <w:t>Falha contínua por sobrecarga ou timeout de dependência</w:t>
+              <w:t>Pagamento com sobrecarga, timeout de dependência ou circuito preso em aberto</w:t>
             </w:r>
           </w:p>
         </w:tc>
@@ -504,7 +492,7 @@
         <w:spacing w:after="140"/>
       </w:pPr>
       <w:r>
-        <w:t>A rota /work retorna 503 continuamente enquanto sua falha simulada está ativa. Existem duas causas: OverloadError e DependencyTimeoutError. Ambas produzem o mesmo status HTTP, mas a primeira exige reset_overload e a segunda restore_dependency. A rota /repair rejeita a ação incompatível com a causa ativa. A rota /carga original inicia uma tarefa de CPU por 20 segundos e é separada da demonstração de reparo.</w:t>
+        <w:t>A rota /work do serviço carga retorna 503 enquanto a falha simulada está ativa. Há três causas de pagamento: OverloadError, DependencyTimeoutError e CircuitOpenError. Elas exigem, respectivamente, reset_overload, restore_dependency e reset_circuit_breaker. A rota /repair rejeita a ação incompatível com a causa ativa. A rota /carga original inicia uma tarefa de CPU por 20 segundos e é separada da demonstração de reparo.</w:t>
       </w:r>
     </w:p>
     <w:p>
@@ -784,7 +772,7 @@
         <w:spacing w:after="140"/>
       </w:pPr>
       <w:r>
-        <w:t>executar_cenarios.py prepara o token, sobe os cinco contêineres, executa um episódio e grava relatório e verdade-terreno em containers/resultados. avaliar_agente.py repete episódios e calcula recall de detecção, acerto da causa raiz, reparo verificado, falsos alarmes e tempo até decisão. comparar_detectores.py prepara três casos conhecidos e compara rf, memory e qwen_memory nas duas causas de carga. demonstrar_aprendizado.py mostra o uso posterior da memória após três reparos verificados do mesmo erro.</w:t>
+        <w:t>executar_cenarios.py e comparar_detectores.py preservam os experimentos anteriores. Para a loja, executar_loja.py prepara os serviços e, por padrão, chama comparar_loja.py. Este script prepara uma memória inicial com três reparos verificados de sobrecarga, restaura essa mesma memória antes de cada episódio e executa cinco causas para cada estratégia, totalizando 15 episódios. O estoque também é reiniciado antes de cada episódio. O resultado fica em JSON e em um HTML para PC, com quadro comparativo e uma narrativa separada para cada episódio.</w:t>
       </w:r>
     </w:p>
     <w:p>
@@ -1124,7 +1112,7 @@
         <w:spacing w:after="140"/>
       </w:pPr>
       <w:r>
-        <w:t>Para reutilizar imagens já construídas, acrescente --sem-build. Para escolher a política e a causa, use --strategy rf|memory|qwen_memory e --cause overload|dependency_timeout. A opção qwen_memory requer Ollama acessível ao contêiner e o modelo qwen2.5:1.5b-instruct-q4_K_M instalado.</w:t>
+        <w:t>Para comparar as três estratégias na loja, execute python containers/executar_loja.py. Acrescente --sem-build para reutilizar imagens já construídas. O comando gera 15 episódios e um relatório HTML em containers/resultados. Para executar somente um episódio, use --strategy rf|memory|qwen_memory e --cause com uma das cinco causas listadas abaixo. A opção qwen_memory requer Ollama acessível ao contêiner e o modelo qwen2.5:1.5b-instruct-q4_K_M instalado.</w:t>
       </w:r>
     </w:p>
     <w:p>
@@ -1196,7 +1184,229 @@
         <w:spacing w:after="140"/>
       </w:pPr>
       <w:r>
-        <w:t>A falha intermitente de instavel afeta as reservas; a falha contínua de carga afeta os pagamentos. Ambas geram eventos com status e ID de correlação, coletados pelo agente. O comando python containers/executar_loja.py prepara e inicia os cinco contêineres, cria 22 pedidos automaticamente durante as falhas, aguarda o agente e cria mais três pedidos para verificar o resultado. Se os contêineres já estiverem ativos, python containers/demo_loja.py executa apenas o episódio. As opções --strategy e --cause escolhem a decisão do agente e a causa do erro de pagamento. O script salva os dados em containers/resultados/loja_*.json e gera um relatório HTML com resumo, sequência de pedidos, narrativa do incidente, ações do agente e explicação de cada resultado. Abra o HTML no navegador de PC. Um JSON anterior pode ser convertido com python containers/relatorio_loja.py seguido do caminho do arquivo.</w:t>
+        <w:t>Na comparação da loja, apenas um serviço recebe a falha em cada episódio. O script envia 22 pedidos na mesma sequência de peças e tamanhos, aguarda a decisão do agente e envia três pedidos finais para verificar a recuperação. O HTML mostra os pedidos em ordem com cores para confirmação, falha ou pendência e indica a primeira ação do agente. A narrativa informa a ação escolhida, sua origem e se o próprio serviço confirmou o reparo. Os IDs e eventos completos permanecem no JSON, sem ocupar a apresentação visual.</w:t>
+      </w:r>
+    </w:p>
+    <w:p>
+      <w:pPr>
+        <w:pStyle w:val="Heading1"/>
+      </w:pPr>
+      <w:r>
+        <w:t>Cinco causas da comparação da loja</w:t>
+      </w:r>
+    </w:p>
+    <w:p>
+      <w:r>
+        <w:t>Cada causa técnica retorna HTTP 503, mas exige uma ação específica. O Random Forest identifica o padrão de falha nas três estratégias. A diferença entre elas está na escolha do reparo.</w:t>
+      </w:r>
+    </w:p>
+    <w:tbl>
+      <w:tblPr>
+        <w:tblStyle w:val="TableGrid"/>
+        <w:tblW w:type="auto" w:w="0"/>
+        <w:tblLook w:firstColumn="1" w:firstRow="1" w:lastColumn="0" w:lastRow="0" w:noHBand="0" w:noVBand="1" w:val="04A0"/>
+      </w:tblPr>
+      <w:tblGrid>
+        <w:gridCol w:w="3173"/>
+        <w:gridCol w:w="3173"/>
+        <w:gridCol w:w="3173"/>
+      </w:tblGrid>
+      <w:tr>
+        <w:tc>
+          <w:tcPr>
+            <w:tcW w:type="dxa" w:w="3173"/>
+          </w:tcPr>
+          <w:p>
+            <w:r>
+              <w:t>Causa</w:t>
+            </w:r>
+          </w:p>
+        </w:tc>
+        <w:tc>
+          <w:tcPr>
+            <w:tcW w:type="dxa" w:w="3173"/>
+          </w:tcPr>
+          <w:p>
+            <w:r>
+              <w:t>Serviço</w:t>
+            </w:r>
+          </w:p>
+        </w:tc>
+        <w:tc>
+          <w:tcPr>
+            <w:tcW w:type="dxa" w:w="3173"/>
+          </w:tcPr>
+          <w:p>
+            <w:r>
+              <w:t>Reparo esperado</w:t>
+            </w:r>
+          </w:p>
+        </w:tc>
+      </w:tr>
+      <w:tr>
+        <w:tc>
+          <w:tcPr>
+            <w:tcW w:type="dxa" w:w="3173"/>
+          </w:tcPr>
+          <w:p>
+            <w:r>
+              <w:t>Sobrecarga</w:t>
+            </w:r>
+          </w:p>
+        </w:tc>
+        <w:tc>
+          <w:tcPr>
+            <w:tcW w:type="dxa" w:w="3173"/>
+          </w:tcPr>
+          <w:p>
+            <w:r>
+              <w:t>Pagamento</w:t>
+            </w:r>
+          </w:p>
+        </w:tc>
+        <w:tc>
+          <w:tcPr>
+            <w:tcW w:type="dxa" w:w="3173"/>
+          </w:tcPr>
+          <w:p>
+            <w:r>
+              <w:t>Restabelecer após sobrecarga</w:t>
+            </w:r>
+          </w:p>
+        </w:tc>
+      </w:tr>
+      <w:tr>
+        <w:tc>
+          <w:tcPr>
+            <w:tcW w:type="dxa" w:w="3173"/>
+          </w:tcPr>
+          <w:p>
+            <w:r>
+              <w:t>Tempo esgotado na dependência</w:t>
+            </w:r>
+          </w:p>
+        </w:tc>
+        <w:tc>
+          <w:tcPr>
+            <w:tcW w:type="dxa" w:w="3173"/>
+          </w:tcPr>
+          <w:p>
+            <w:r>
+              <w:t>Pagamento</w:t>
+            </w:r>
+          </w:p>
+        </w:tc>
+        <w:tc>
+          <w:tcPr>
+            <w:tcW w:type="dxa" w:w="3173"/>
+          </w:tcPr>
+          <w:p>
+            <w:r>
+              <w:t>Restabelecer a dependência</w:t>
+            </w:r>
+          </w:p>
+        </w:tc>
+      </w:tr>
+      <w:tr>
+        <w:tc>
+          <w:tcPr>
+            <w:tcW w:type="dxa" w:w="3173"/>
+          </w:tcPr>
+          <w:p>
+            <w:r>
+              <w:t>Dependência indisponível</w:t>
+            </w:r>
+          </w:p>
+        </w:tc>
+        <w:tc>
+          <w:tcPr>
+            <w:tcW w:type="dxa" w:w="3173"/>
+          </w:tcPr>
+          <w:p>
+            <w:r>
+              <w:t>Estoque</w:t>
+            </w:r>
+          </w:p>
+        </w:tc>
+        <w:tc>
+          <w:tcPr>
+            <w:tcW w:type="dxa" w:w="3173"/>
+          </w:tcPr>
+          <w:p>
+            <w:r>
+              <w:t>Restabelecer a dependência do estoque</w:t>
+            </w:r>
+          </w:p>
+        </w:tc>
+      </w:tr>
+      <w:tr>
+        <w:tc>
+          <w:tcPr>
+            <w:tcW w:type="dxa" w:w="3173"/>
+          </w:tcPr>
+          <w:p>
+            <w:r>
+              <w:t>Reserva bloqueada</w:t>
+            </w:r>
+          </w:p>
+        </w:tc>
+        <w:tc>
+          <w:tcPr>
+            <w:tcW w:type="dxa" w:w="3173"/>
+          </w:tcPr>
+          <w:p>
+            <w:r>
+              <w:t>Estoque</w:t>
+            </w:r>
+          </w:p>
+        </w:tc>
+        <w:tc>
+          <w:tcPr>
+            <w:tcW w:type="dxa" w:w="3173"/>
+          </w:tcPr>
+          <w:p>
+            <w:r>
+              <w:t>Liberar o bloqueio simulado</w:t>
+            </w:r>
+          </w:p>
+        </w:tc>
+      </w:tr>
+      <w:tr>
+        <w:tc>
+          <w:tcPr>
+            <w:tcW w:type="dxa" w:w="3173"/>
+          </w:tcPr>
+          <w:p>
+            <w:r>
+              <w:t>Circuito preso em aberto</w:t>
+            </w:r>
+          </w:p>
+        </w:tc>
+        <w:tc>
+          <w:tcPr>
+            <w:tcW w:type="dxa" w:w="3173"/>
+          </w:tcPr>
+          <w:p>
+            <w:r>
+              <w:t>Pagamento</w:t>
+            </w:r>
+          </w:p>
+        </w:tc>
+        <w:tc>
+          <w:tcPr>
+            <w:tcW w:type="dxa" w:w="3173"/>
+          </w:tcPr>
+          <w:p>
+            <w:r>
+              <w:t>Reiniciar o circuito</w:t>
+            </w:r>
+          </w:p>
+        </w:tc>
+      </w:tr>
+    </w:tbl>
+    <w:p>
+      <w:r>
+        <w:t>Na execução de 28 de outubro de 2026, o reparo foi confirmado em 1 de 5 causas com Random Forest, 1 de 5 com Random Forest e memória, e 4 de 5 com Qwen e memória. No caso da dependência do estoque, Qwen escolheu a ação errada. Este resultado descreve a simulação realizada; cinco causas distintas e uma execução por causa não demonstram superioridade estatística geral.</w:t>
       </w:r>
     </w:p>
     <w:sectPr>

</xml_diff>